<commit_message>
feat(US-03): implement AccessPassMiddleware, PassContext and validation (T-3.6)
</commit_message>
<xml_diff>
--- a/promt.docx
+++ b/promt.docx
@@ -11,6 +11,7 @@
         <w:suppressLineNumbers w:val="0"/>
         <w:bidi w:val="0"/>
         <w:rPr>
+          <w:rStyle w:val="6"/>
           <w:rFonts w:hint="default" w:ascii="Times New Roman" w:hAnsi="Times New Roman" w:cs="Times New Roman"/>
         </w:rPr>
       </w:pPr>
@@ -30,113 +31,335 @@
         <w:widowControl/>
         <w:suppressLineNumbers w:val="0"/>
         <w:bidi w:val="0"/>
-        <w:ind w:left="720" w:right="720"/>
-        <w:rPr>
-          <w:rFonts w:hint="default" w:ascii="Times New Roman" w:hAnsi="Times New Roman" w:cs="Times New Roman"/>
-        </w:rPr>
-      </w:pPr>
-      <w:r>
-        <w:rPr>
-          <w:rFonts w:hint="default" w:ascii="Times New Roman" w:hAnsi="Times New Roman" w:eastAsia="SimSun" w:cs="Times New Roman"/>
-          <w:sz w:val="24"/>
-          <w:szCs w:val="24"/>
-        </w:rPr>
-        <w:t xml:space="preserve">Đọc </w:t>
-      </w:r>
-      <w:r>
-        <w:rPr>
-          <w:rStyle w:val="4"/>
-          <w:rFonts w:hint="default" w:ascii="Times New Roman" w:hAnsi="Times New Roman" w:eastAsia="SimSun" w:cs="Times New Roman"/>
-          <w:sz w:val="24"/>
-          <w:szCs w:val="24"/>
-        </w:rPr>
-        <w:t>CLAUDE.md</w:t>
-      </w:r>
-      <w:r>
-        <w:rPr>
-          <w:rFonts w:hint="default" w:ascii="Times New Roman" w:hAnsi="Times New Roman" w:eastAsia="SimSun" w:cs="Times New Roman"/>
-          <w:sz w:val="24"/>
-          <w:szCs w:val="24"/>
-        </w:rPr>
-        <w:t xml:space="preserve">, </w:t>
-      </w:r>
-      <w:r>
-        <w:rPr>
-          <w:rStyle w:val="4"/>
-          <w:rFonts w:hint="default" w:ascii="Times New Roman" w:hAnsi="Times New Roman" w:eastAsia="SimSun" w:cs="Times New Roman"/>
-          <w:sz w:val="24"/>
-          <w:szCs w:val="24"/>
-        </w:rPr>
-        <w:t>docs/PROGRESS.md</w:t>
-      </w:r>
-      <w:r>
-        <w:rPr>
-          <w:rFonts w:hint="default" w:ascii="Times New Roman" w:hAnsi="Times New Roman" w:eastAsia="SimSun" w:cs="Times New Roman"/>
-          <w:sz w:val="24"/>
-          <w:szCs w:val="24"/>
-        </w:rPr>
-        <w:t xml:space="preserve">, </w:t>
-      </w:r>
-      <w:r>
-        <w:rPr>
-          <w:rStyle w:val="4"/>
-          <w:rFonts w:hint="default" w:ascii="Times New Roman" w:hAnsi="Times New Roman" w:eastAsia="SimSun" w:cs="Times New Roman"/>
-          <w:sz w:val="24"/>
-          <w:szCs w:val="24"/>
-        </w:rPr>
-        <w:t>docs/TASKS.md</w:t>
-      </w:r>
-      <w:r>
-        <w:rPr>
-          <w:rFonts w:hint="default" w:ascii="Times New Roman" w:hAnsi="Times New Roman" w:eastAsia="SimSun" w:cs="Times New Roman"/>
-          <w:sz w:val="24"/>
-          <w:szCs w:val="24"/>
-        </w:rPr>
-        <w:t xml:space="preserve">, rồi chạy </w:t>
-      </w:r>
-      <w:r>
-        <w:rPr>
-          <w:rStyle w:val="4"/>
-          <w:rFonts w:hint="default" w:ascii="Times New Roman" w:hAnsi="Times New Roman" w:eastAsia="SimSun" w:cs="Times New Roman"/>
-          <w:sz w:val="24"/>
-          <w:szCs w:val="24"/>
-        </w:rPr>
-        <w:t>git status</w:t>
-      </w:r>
-      <w:r>
-        <w:rPr>
-          <w:rFonts w:hint="default" w:ascii="Times New Roman" w:hAnsi="Times New Roman" w:eastAsia="SimSun" w:cs="Times New Roman"/>
-          <w:sz w:val="24"/>
-          <w:szCs w:val="24"/>
-        </w:rPr>
-        <w:t xml:space="preserve"> và </w:t>
-      </w:r>
-      <w:r>
-        <w:rPr>
-          <w:rStyle w:val="4"/>
-          <w:rFonts w:hint="default" w:ascii="Times New Roman" w:hAnsi="Times New Roman" w:eastAsia="SimSun" w:cs="Times New Roman"/>
-          <w:sz w:val="24"/>
-          <w:szCs w:val="24"/>
-        </w:rPr>
-        <w:t>git log --oneline -5</w:t>
-      </w:r>
-      <w:r>
-        <w:rPr>
-          <w:rFonts w:hint="default" w:ascii="Times New Roman" w:hAnsi="Times New Roman" w:eastAsia="SimSun" w:cs="Times New Roman"/>
-          <w:sz w:val="24"/>
-          <w:szCs w:val="24"/>
-        </w:rPr>
-        <w:t>. Tóm tắt mình đang ở task nào, có gì dang dở, bước kế tiếp</w:t>
+        <w:rPr>
+          <w:rStyle w:val="6"/>
+          <w:rFonts w:hint="default" w:ascii="Times New Roman" w:hAnsi="Times New Roman" w:cs="Times New Roman"/>
+          <w:lang w:val="en-US"/>
+        </w:rPr>
+      </w:pPr>
+      <w:r>
+        <w:rPr>
+          <w:rStyle w:val="6"/>
+          <w:rFonts w:hint="default" w:cs="Times New Roman"/>
+          <w:lang w:val="en-US"/>
+        </w:rPr>
+        <w:t>Có thể dùng mẫu này để kêu AI cũ dựa trên mẫu này để làm promt mới</w:t>
       </w:r>
       <w:bookmarkStart w:id="0" w:name="_GoBack"/>
       <w:bookmarkEnd w:id="0"/>
-      <w:r>
-        <w:rPr>
-          <w:rFonts w:hint="default" w:ascii="Times New Roman" w:hAnsi="Times New Roman" w:eastAsia="SimSun" w:cs="Times New Roman"/>
-          <w:sz w:val="24"/>
-          <w:szCs w:val="24"/>
-        </w:rPr>
-        <w:t xml:space="preserve"> là gì. Chưa code, chờ mình xác nhận.</w:t>
+    </w:p>
+    <w:p>
+      <w:pPr>
+        <w:rPr>
+          <w:rFonts w:hint="default" w:ascii="Times New Roman" w:hAnsi="Times New Roman" w:cs="Times New Roman"/>
+        </w:rPr>
+      </w:pPr>
+      <w:r>
+        <w:rPr>
+          <w:rFonts w:hint="default" w:ascii="Times New Roman" w:hAnsi="Times New Roman" w:cs="Times New Roman"/>
+        </w:rPr>
+        <w:t>Xin chào, tôi muốn tiếp tục phát triển dự án MultiGuide Backend (.NET 10, kiến trúc 3 lớp: Api -&gt; Business &lt;- Data; cả 3 -&gt; Domain).</w:t>
+      </w:r>
+    </w:p>
+    <w:p>
+      <w:pPr>
+        <w:rPr>
+          <w:rFonts w:hint="default" w:ascii="Times New Roman" w:hAnsi="Times New Roman" w:cs="Times New Roman"/>
+        </w:rPr>
+      </w:pPr>
+    </w:p>
+    <w:p>
+      <w:pPr>
+        <w:rPr>
+          <w:rFonts w:hint="default" w:ascii="Times New Roman" w:hAnsi="Times New Roman" w:cs="Times New Roman"/>
+        </w:rPr>
+      </w:pPr>
+      <w:r>
+        <w:rPr>
+          <w:rFonts w:hint="default" w:ascii="Times New Roman" w:hAnsi="Times New Roman" w:cs="Times New Roman"/>
+        </w:rPr>
+        <w:t>Hiện tại:</w:t>
+      </w:r>
+    </w:p>
+    <w:p>
+      <w:pPr>
+        <w:rPr>
+          <w:rFonts w:hint="default" w:ascii="Times New Roman" w:hAnsi="Times New Roman" w:cs="Times New Roman"/>
+        </w:rPr>
+      </w:pPr>
+      <w:r>
+        <w:rPr>
+          <w:rFonts w:hint="default" w:ascii="Times New Roman" w:hAnsi="Times New Roman" w:cs="Times New Roman"/>
+        </w:rPr>
+        <w:t>- Toàn bộ Ngày 1 và các Task T-2.1, T-2.2 của Ngày 2 đã hoàn thành 100% (31/31 bài test xanh, hệ thống live trên Render, Supabase Auth với tài khoản admin quanghi176@gmail.com đã kích hoạt).</w:t>
+      </w:r>
+    </w:p>
+    <w:p>
+      <w:pPr>
+        <w:rPr>
+          <w:rFonts w:hint="default" w:ascii="Times New Roman" w:hAnsi="Times New Roman" w:cs="Times New Roman"/>
+        </w:rPr>
+      </w:pPr>
+      <w:r>
+        <w:rPr>
+          <w:rFonts w:hint="default" w:ascii="Times New Roman" w:hAnsi="Times New Roman" w:cs="Times New Roman"/>
+        </w:rPr>
+        <w:t>- Bây giờ chúng ta sẽ bắt đầu thực hiện Task tiếp theo: Task T-2.3 — Business: interface Repository + AdminContentService cho tour_area; Data: repository (US-10).</w:t>
+      </w:r>
+    </w:p>
+    <w:p>
+      <w:pPr>
+        <w:rPr>
+          <w:rFonts w:hint="default" w:ascii="Times New Roman" w:hAnsi="Times New Roman" w:cs="Times New Roman"/>
+        </w:rPr>
+      </w:pPr>
+    </w:p>
+    <w:p>
+      <w:pPr>
+        <w:rPr>
+          <w:rFonts w:hint="default" w:ascii="Times New Roman" w:hAnsi="Times New Roman" w:cs="Times New Roman"/>
+        </w:rPr>
+      </w:pPr>
+      <w:r>
+        <w:rPr>
+          <w:rFonts w:hint="default" w:ascii="Times New Roman" w:hAnsi="Times New Roman" w:cs="Times New Roman"/>
+        </w:rPr>
+        <w:t>BƯỚC 1 — ĐỌC VÀ NẮM NGỮ CẢNH DỰ ÁN (BẮT BUỘC):</w:t>
+      </w:r>
+    </w:p>
+    <w:p>
+      <w:pPr>
+        <w:rPr>
+          <w:rFonts w:hint="default" w:ascii="Times New Roman" w:hAnsi="Times New Roman" w:cs="Times New Roman"/>
+        </w:rPr>
+      </w:pPr>
+      <w:r>
+        <w:rPr>
+          <w:rFonts w:hint="default" w:ascii="Times New Roman" w:hAnsi="Times New Roman" w:cs="Times New Roman"/>
+        </w:rPr>
+        <w:t>Trước khi viết bất kỳ dòng code nào, hãy đọc kỹ:</w:t>
+      </w:r>
+    </w:p>
+    <w:p>
+      <w:pPr>
+        <w:rPr>
+          <w:rFonts w:hint="default" w:ascii="Times New Roman" w:hAnsi="Times New Roman" w:cs="Times New Roman"/>
+        </w:rPr>
+      </w:pPr>
+      <w:r>
+        <w:rPr>
+          <w:rFonts w:hint="default" w:ascii="Times New Roman" w:hAnsi="Times New Roman" w:cs="Times New Roman"/>
+        </w:rPr>
+        <w:t>1. CLAUDE.md (Quy tắc cứng và kiến trúc 3 lớp: Business tuyệt đối không biết EF Core/HTTP; Data implement interface từ Business).</w:t>
+      </w:r>
+    </w:p>
+    <w:p>
+      <w:pPr>
+        <w:rPr>
+          <w:rFonts w:hint="default" w:ascii="Times New Roman" w:hAnsi="Times New Roman" w:cs="Times New Roman"/>
+        </w:rPr>
+      </w:pPr>
+      <w:r>
+        <w:rPr>
+          <w:rFonts w:hint="default" w:ascii="Times New Roman" w:hAnsi="Times New Roman" w:cs="Times New Roman"/>
+        </w:rPr>
+        <w:t>2. docs/PROGRESS.md và docs/TASKS.md (Hiện trạng dự án và danh sách việc).</w:t>
+      </w:r>
+    </w:p>
+    <w:p>
+      <w:pPr>
+        <w:rPr>
+          <w:rFonts w:hint="default" w:ascii="Times New Roman" w:hAnsi="Times New Roman" w:cs="Times New Roman"/>
+        </w:rPr>
+      </w:pPr>
+      <w:r>
+        <w:rPr>
+          <w:rFonts w:hint="default" w:ascii="Times New Roman" w:hAnsi="Times New Roman" w:cs="Times New Roman"/>
+        </w:rPr>
+        <w:t>3. docs/DECISIONS.md (Các quyết định công nghệ đã chốt).</w:t>
+      </w:r>
+    </w:p>
+    <w:p>
+      <w:pPr>
+        <w:rPr>
+          <w:rFonts w:hint="default" w:ascii="Times New Roman" w:hAnsi="Times New Roman" w:cs="Times New Roman"/>
+        </w:rPr>
+      </w:pPr>
+      <w:r>
+        <w:rPr>
+          <w:rFonts w:hint="default" w:ascii="Times New Roman" w:hAnsi="Times New Roman" w:cs="Times New Roman"/>
+        </w:rPr>
+        <w:t>4. docs/ARCHITECTURE.md, docs/ERD.md và docs/PRD.md (mục 4, 6 và US-10 trong mục 7).</w:t>
+      </w:r>
+    </w:p>
+    <w:p>
+      <w:pPr>
+        <w:rPr>
+          <w:rFonts w:hint="default" w:ascii="Times New Roman" w:hAnsi="Times New Roman" w:cs="Times New Roman"/>
+        </w:rPr>
+      </w:pPr>
+    </w:p>
+    <w:p>
+      <w:pPr>
+        <w:rPr>
+          <w:rFonts w:hint="default" w:ascii="Times New Roman" w:hAnsi="Times New Roman" w:cs="Times New Roman"/>
+        </w:rPr>
+      </w:pPr>
+      <w:r>
+        <w:rPr>
+          <w:rFonts w:hint="default" w:ascii="Times New Roman" w:hAnsi="Times New Roman" w:cs="Times New Roman"/>
+        </w:rPr>
+        <w:t>BƯỚC 2 — KIỂM TRA HIỆN TRẠNG &amp; TÌM FILE LIÊN QUAN ĐẾN TASK T-2.3:</w:t>
+      </w:r>
+    </w:p>
+    <w:p>
+      <w:pPr>
+        <w:rPr>
+          <w:rFonts w:hint="default" w:ascii="Times New Roman" w:hAnsi="Times New Roman" w:cs="Times New Roman"/>
+        </w:rPr>
+      </w:pPr>
+      <w:r>
+        <w:rPr>
+          <w:rFonts w:hint="default" w:ascii="Times New Roman" w:hAnsi="Times New Roman" w:cs="Times New Roman"/>
+        </w:rPr>
+        <w:t>1. Chạy `git status` và `git log --oneline -5` để xác nhận nhánh sạch và commit mới nhất.</w:t>
+      </w:r>
+    </w:p>
+    <w:p>
+      <w:pPr>
+        <w:rPr>
+          <w:rFonts w:hint="default" w:ascii="Times New Roman" w:hAnsi="Times New Roman" w:cs="Times New Roman"/>
+        </w:rPr>
+      </w:pPr>
+      <w:r>
+        <w:rPr>
+          <w:rFonts w:hint="default" w:ascii="Times New Roman" w:hAnsi="Times New Roman" w:cs="Times New Roman"/>
+        </w:rPr>
+        <w:t>2. Kiểm tra entity `TourArea.cs`, `MultiGuideDbContext.cs`, và `DependencyInjection.cs` của Business &amp; Data.</w:t>
+      </w:r>
+    </w:p>
+    <w:p>
+      <w:pPr>
+        <w:rPr>
+          <w:rFonts w:hint="default" w:ascii="Times New Roman" w:hAnsi="Times New Roman" w:cs="Times New Roman"/>
+        </w:rPr>
+      </w:pPr>
+    </w:p>
+    <w:p>
+      <w:pPr>
+        <w:rPr>
+          <w:rFonts w:hint="default" w:ascii="Times New Roman" w:hAnsi="Times New Roman" w:cs="Times New Roman"/>
+        </w:rPr>
+      </w:pPr>
+      <w:r>
+        <w:rPr>
+          <w:rFonts w:hint="default" w:ascii="Times New Roman" w:hAnsi="Times New Roman" w:cs="Times New Roman"/>
+        </w:rPr>
+        <w:t>BƯỚC 3 — ĐỀ XUẤT KẾ HOẠCH &amp; CHỜ XÁC NHẬN:</w:t>
+      </w:r>
+    </w:p>
+    <w:p>
+      <w:pPr>
+        <w:rPr>
+          <w:rFonts w:hint="default" w:ascii="Times New Roman" w:hAnsi="Times New Roman" w:cs="Times New Roman"/>
+        </w:rPr>
+      </w:pPr>
+      <w:r>
+        <w:rPr>
+          <w:rFonts w:hint="default" w:ascii="Times New Roman" w:hAnsi="Times New Roman" w:cs="Times New Roman"/>
+        </w:rPr>
+        <w:t>- Tóm tắt ngắn gọn hiện trạng dự án.</w:t>
+      </w:r>
+    </w:p>
+    <w:p>
+      <w:pPr>
+        <w:rPr>
+          <w:rFonts w:hint="default" w:ascii="Times New Roman" w:hAnsi="Times New Roman" w:cs="Times New Roman"/>
+        </w:rPr>
+      </w:pPr>
+      <w:r>
+        <w:rPr>
+          <w:rFonts w:hint="default" w:ascii="Times New Roman" w:hAnsi="Times New Roman" w:cs="Times New Roman"/>
+        </w:rPr>
+        <w:t>- Đề xuất thiết kế chi tiết cho Task T-2.3:</w:t>
+      </w:r>
+    </w:p>
+    <w:p>
+      <w:pPr>
+        <w:rPr>
+          <w:rFonts w:hint="default" w:ascii="Times New Roman" w:hAnsi="Times New Roman" w:cs="Times New Roman"/>
+        </w:rPr>
+      </w:pPr>
+      <w:r>
+        <w:rPr>
+          <w:rFonts w:hint="default" w:ascii="Times New Roman" w:hAnsi="Times New Roman" w:cs="Times New Roman"/>
+        </w:rPr>
+        <w:t xml:space="preserve">  + Định nghĩa interface `IAreaRepository` trong tầng Business (các phương thức tìm theo Id, Code, lấy danh sách, thêm, sửa, kiểm tra trùng code).</w:t>
+      </w:r>
+    </w:p>
+    <w:p>
+      <w:pPr>
+        <w:rPr>
+          <w:rFonts w:hint="default" w:ascii="Times New Roman" w:hAnsi="Times New Roman" w:cs="Times New Roman"/>
+        </w:rPr>
+      </w:pPr>
+      <w:r>
+        <w:rPr>
+          <w:rFonts w:hint="default" w:ascii="Times New Roman" w:hAnsi="Times New Roman" w:cs="Times New Roman"/>
+        </w:rPr>
+        <w:t xml:space="preserve">  + Định nghĩa DTOs và nghiệp vụ trong `AdminContentService` (tầng Business): validate code chuẩn chữ thường/số/gạch ngang, validate giá &gt; 0, kiểm tra unique code (trùng ném ConflictException mã lỗi DUPLICATE_REQUEST / CONFLICT), xóa mềm (is_active = false).</w:t>
+      </w:r>
+    </w:p>
+    <w:p>
+      <w:pPr>
+        <w:rPr>
+          <w:rFonts w:hint="default" w:ascii="Times New Roman" w:hAnsi="Times New Roman" w:cs="Times New Roman"/>
+        </w:rPr>
+      </w:pPr>
+      <w:r>
+        <w:rPr>
+          <w:rFonts w:hint="default" w:ascii="Times New Roman" w:hAnsi="Times New Roman" w:cs="Times New Roman"/>
+        </w:rPr>
+        <w:t xml:space="preserve">  + Triển khai `AreaRepository` trong tầng Data bằng EF Core.</w:t>
+      </w:r>
+    </w:p>
+    <w:p>
+      <w:pPr>
+        <w:rPr>
+          <w:rFonts w:hint="default" w:ascii="Times New Roman" w:hAnsi="Times New Roman" w:cs="Times New Roman"/>
+        </w:rPr>
+      </w:pPr>
+      <w:r>
+        <w:rPr>
+          <w:rFonts w:hint="default" w:ascii="Times New Roman" w:hAnsi="Times New Roman" w:cs="Times New Roman"/>
+        </w:rPr>
+        <w:t xml:space="preserve">  + Đăng ký DI trong Business &amp; Data.</w:t>
+      </w:r>
+    </w:p>
+    <w:p>
+      <w:pPr>
+        <w:rPr>
+          <w:rFonts w:hint="default" w:ascii="Times New Roman" w:hAnsi="Times New Roman" w:cs="Times New Roman"/>
+        </w:rPr>
+      </w:pPr>
+      <w:r>
+        <w:rPr>
+          <w:rFonts w:hint="default" w:ascii="Times New Roman" w:hAnsi="Times New Roman" w:cs="Times New Roman"/>
+        </w:rPr>
+        <w:t xml:space="preserve">  + Kế hoạch viết Unit Test cho `AdminContentService` (mock IAreaRepository) trong `MultiGuide.Business.Tests`.</w:t>
+      </w:r>
+    </w:p>
+    <w:p>
+      <w:pPr>
+        <w:rPr>
+          <w:rFonts w:hint="default" w:ascii="Times New Roman" w:hAnsi="Times New Roman" w:cs="Times New Roman"/>
+        </w:rPr>
+      </w:pPr>
+      <w:r>
+        <w:rPr>
+          <w:rFonts w:hint="default" w:ascii="Times New Roman" w:hAnsi="Times New Roman" w:cs="Times New Roman"/>
+        </w:rPr>
+        <w:t>- DỪNG LẠI VÀ CHỜ TÔI XÁC NHẬN DUYỆT KẾ HOẠCH rồi mới tiến hành viết code.</w:t>
       </w:r>
     </w:p>
     <w:p>
@@ -259,18 +482,18 @@
     <w:lsdException w:unhideWhenUsed="0" w:uiPriority="0" w:semiHidden="0" w:name="Document Map"/>
     <w:lsdException w:unhideWhenUsed="0" w:uiPriority="0" w:semiHidden="0" w:name="Plain Text"/>
     <w:lsdException w:unhideWhenUsed="0" w:uiPriority="0" w:semiHidden="0" w:name="E-mail Signature"/>
-    <w:lsdException w:unhideWhenUsed="0" w:uiPriority="0" w:semiHidden="0" w:name="Normal (Web)"/>
+    <w:lsdException w:qFormat="1" w:unhideWhenUsed="0" w:uiPriority="0" w:semiHidden="0" w:name="Normal (Web)"/>
     <w:lsdException w:unhideWhenUsed="0" w:uiPriority="0" w:semiHidden="0" w:name="HTML Acronym"/>
     <w:lsdException w:unhideWhenUsed="0" w:uiPriority="0" w:semiHidden="0" w:name="HTML Address"/>
     <w:lsdException w:unhideWhenUsed="0" w:uiPriority="0" w:semiHidden="0" w:name="HTML Cite"/>
-    <w:lsdException w:unhideWhenUsed="0" w:uiPriority="0" w:semiHidden="0" w:name="HTML Code"/>
+    <w:lsdException w:qFormat="1" w:unhideWhenUsed="0" w:uiPriority="0" w:semiHidden="0" w:name="HTML Code"/>
     <w:lsdException w:unhideWhenUsed="0" w:uiPriority="0" w:semiHidden="0" w:name="HTML Definition"/>
     <w:lsdException w:unhideWhenUsed="0" w:uiPriority="0" w:semiHidden="0" w:name="HTML Keyboard"/>
     <w:lsdException w:unhideWhenUsed="0" w:uiPriority="0" w:semiHidden="0" w:name="HTML Preformatted"/>
     <w:lsdException w:unhideWhenUsed="0" w:uiPriority="0" w:semiHidden="0" w:name="HTML Sample"/>
     <w:lsdException w:unhideWhenUsed="0" w:uiPriority="0" w:semiHidden="0" w:name="HTML Typewriter"/>
     <w:lsdException w:unhideWhenUsed="0" w:uiPriority="0" w:semiHidden="0" w:name="HTML Variable"/>
-    <w:lsdException w:unhideWhenUsed="0" w:uiPriority="0" w:name="Normal Table"/>
+    <w:lsdException w:qFormat="1" w:unhideWhenUsed="0" w:uiPriority="0" w:name="Normal Table"/>
     <w:lsdException w:unhideWhenUsed="0" w:uiPriority="0" w:semiHidden="0" w:name="annotation subject"/>
     <w:lsdException w:unhideWhenUsed="0" w:uiPriority="0" w:semiHidden="0" w:name="Table Simple 1"/>
     <w:lsdException w:unhideWhenUsed="0" w:uiPriority="0" w:semiHidden="0" w:name="Table Simple 2"/>
@@ -434,6 +657,7 @@
   <w:style w:type="table" w:default="1" w:styleId="3">
     <w:name w:val="Normal Table"/>
     <w:semiHidden/>
+    <w:qFormat/>
     <w:uiPriority w:val="0"/>
     <w:tblPr>
       <w:tblCellMar>
@@ -447,6 +671,7 @@
   <w:style w:type="character" w:styleId="4">
     <w:name w:val="HTML Code"/>
     <w:basedOn w:val="2"/>
+    <w:qFormat/>
     <w:uiPriority w:val="0"/>
     <w:rPr>
       <w:rFonts w:ascii="Courier New" w:hAnsi="Courier New" w:cs="Courier New"/>
@@ -456,6 +681,7 @@
   </w:style>
   <w:style w:type="paragraph" w:styleId="5">
     <w:name w:val="Normal (Web)"/>
+    <w:qFormat/>
     <w:uiPriority w:val="0"/>
     <w:pPr>
       <w:spacing w:before="0" w:beforeAutospacing="1" w:after="0" w:afterAutospacing="1"/>
@@ -463,6 +689,7 @@
       <w:jc w:val="left"/>
     </w:pPr>
     <w:rPr>
+      <w:rFonts w:ascii="Times New Roman" w:hAnsi="Times New Roman" w:eastAsia="SimSun" w:cs="Times New Roman"/>
       <w:kern w:val="0"/>
       <w:sz w:val="24"/>
       <w:szCs w:val="24"/>

</xml_diff>